<commit_message>
feat: Bilder zum Zeitungsartikel hinzufügen und PDF neu exportieren
Schwarz-weiße Symbolbilder fügen der Ransomware-Story und dem
OEM-Audit-Kasten mehr Leben ein; PDF-Export synchron aktualisiert.

Co-Authored-By: Claude Sonnet 5 <noreply@anthropic.com>
</commit_message>
<xml_diff>
--- a/final_documents/Zeitungsartikel.docx
+++ b/final_documents/Zeitungsartikel.docx
@@ -127,6 +127,59 @@
     </w:p>
     <w:p>
       <w:pPr>
+        <w:jc w:val="center"/>
+      </w:pPr>
+      <w:r>
+        <w:drawing>
+          <wp:inline xmlns:a="http://schemas.openxmlformats.org/drawingml/2006/main" xmlns:pic="http://schemas.openxmlformats.org/drawingml/2006/picture">
+            <wp:extent cx="2971800" cy="2228850"/>
+            <wp:docPr id="1" name="Picture 1"/>
+            <wp:cNvGraphicFramePr>
+              <a:graphicFrameLocks noChangeAspect="1"/>
+            </wp:cNvGraphicFramePr>
+            <a:graphic>
+              <a:graphicData uri="http://schemas.openxmlformats.org/drawingml/2006/picture">
+                <pic:pic>
+                  <pic:nvPicPr>
+                    <pic:cNvPr id="0" name="90e21c30-06d7-422b-8b22-2d738c2478ba.png"/>
+                    <pic:cNvPicPr/>
+                  </pic:nvPicPr>
+                  <pic:blipFill>
+                    <a:blip r:embed="rId10"/>
+                    <a:stretch>
+                      <a:fillRect/>
+                    </a:stretch>
+                  </pic:blipFill>
+                  <pic:spPr>
+                    <a:xfrm>
+                      <a:off x="0" y="0"/>
+                      <a:ext cx="2971800" cy="2228850"/>
+                    </a:xfrm>
+                    <a:prstGeom prst="rect"/>
+                  </pic:spPr>
+                </pic:pic>
+              </a:graphicData>
+            </a:graphic>
+          </wp:inline>
+        </w:drawing>
+      </w:r>
+    </w:p>
+    <w:p>
+      <w:pPr>
+        <w:spacing w:after="160"/>
+        <w:jc w:val="center"/>
+      </w:pPr>
+      <w:r>
+        <w:rPr>
+          <w:rFonts w:ascii="Georgia" w:hAnsi="Georgia"/>
+          <w:i/>
+          <w:sz w:val="16"/>
+        </w:rPr>
+        <w:t>Symbolbild: Verschärfte Audits für Zulieferer.</w:t>
+      </w:r>
+    </w:p>
+    <w:p>
+      <w:pPr>
         <w:spacing w:after="80"/>
       </w:pPr>
       <w:r>
@@ -161,6 +214,59 @@
           <w:sz w:val="19"/>
         </w:rPr>
         <w:t>Ein mittelständischer Automotive Zulieferer aus Nordhessen wurde Opfer eines schweren Ransomware-Angriffs. Die Produktion stand für 72 Stunden still, der Schaden wird auf über 500.000 Euro geschätzt.</w:t>
+      </w:r>
+    </w:p>
+    <w:p>
+      <w:pPr>
+        <w:jc w:val="center"/>
+      </w:pPr>
+      <w:r>
+        <w:drawing>
+          <wp:inline xmlns:a="http://schemas.openxmlformats.org/drawingml/2006/main" xmlns:pic="http://schemas.openxmlformats.org/drawingml/2006/picture">
+            <wp:extent cx="2971800" cy="2228850"/>
+            <wp:docPr id="2" name="Picture 2"/>
+            <wp:cNvGraphicFramePr>
+              <a:graphicFrameLocks noChangeAspect="1"/>
+            </wp:cNvGraphicFramePr>
+            <a:graphic>
+              <a:graphicData uri="http://schemas.openxmlformats.org/drawingml/2006/picture">
+                <pic:pic>
+                  <pic:nvPicPr>
+                    <pic:cNvPr id="0" name="36b54d75-0487-48b6-8ad0-32be82f6ca46.png"/>
+                    <pic:cNvPicPr/>
+                  </pic:nvPicPr>
+                  <pic:blipFill>
+                    <a:blip r:embed="rId11"/>
+                    <a:stretch>
+                      <a:fillRect/>
+                    </a:stretch>
+                  </pic:blipFill>
+                  <pic:spPr>
+                    <a:xfrm>
+                      <a:off x="0" y="0"/>
+                      <a:ext cx="2971800" cy="2228850"/>
+                    </a:xfrm>
+                    <a:prstGeom prst="rect"/>
+                  </pic:spPr>
+                </pic:pic>
+              </a:graphicData>
+            </a:graphic>
+          </wp:inline>
+        </w:drawing>
+      </w:r>
+    </w:p>
+    <w:p>
+      <w:pPr>
+        <w:spacing w:after="160"/>
+        <w:jc w:val="center"/>
+      </w:pPr>
+      <w:r>
+        <w:rPr>
+          <w:rFonts w:ascii="Georgia" w:hAnsi="Georgia"/>
+          <w:i/>
+          <w:sz w:val="16"/>
+        </w:rPr>
+        <w:t>Symbolbild: Stillstand in der Fertigung nach Cyberangriff.</w:t>
       </w:r>
     </w:p>
     <w:p>

</xml_diff>